<commit_message>
Sync interview guide and cheat sheet to audit Parts 29 to 31; record noise-scale finding (Part 31)
Guide: new simulation rows (noise, timing, stress, fitness, survivor
composition), Experiment 1 staging (pilot P0, 1a, 1b) and cost floor, new hard
questions (Bonnet, voltage, noise sensitivity, survivor bias), corrected the
claim that neither prior paper shows rewritable, heritable, readable memory,
new never-say items. Cheat sheet regenerated to stay on one page. Audit Part 31
(open): tx_noise scales with dt not sqrt(dt), and bsubtilis_25 compared unlike
quantities; sweeps stay valid for the model at dt 0.02 but are not yet
comparable to measured noise. README and CLAUDE.md updated.

Co-Authored-By: Claude Sonnet 5.5 <noreply@anthropic.com>
Claude-Session: https://claude.ai/code/session_016Mr3C22Kski8z67f9E5xyj
</commit_message>
<xml_diff>
--- a/docs/ACHERON_CHEAT_SHEET.docx
+++ b/docs/ACHERON_CHEAT_SHEET.docx
@@ -194,7 +194,7 @@
               <w:t xml:space="preserve">• </w:t>
             </w:r>
             <w:r>
-              <w:t>Yang 2020 wrote a voltage bit into this bacterium with light, but it is lost when cells divide. Bonnet 2012: rewritable recombinase memory. DNA storage (Biomemory, BioCompute) is archival, read by destroying the sample. Our claim: rewritable, readable, survives division and regrowth.</w:t>
+              <w:t>Yang 2020 wrote a voltage bit into this bacterium with light, lost when cells divide. Bonnet 2012: rewritable DNA memory, heritable over 100+ divisions, read by fluorescence. DNA storage (Biomemory, BioCompute) is archival. We claim no advantage over Bonnet yet. Our open idea: a switch that senses damage and reinforces itself.</w:t>
             </w:r>
           </w:p>
           <w:p>
@@ -218,7 +218,31 @@
               <w:t xml:space="preserve">• </w:t>
             </w:r>
             <w:r>
-              <w:t>Experiment 1 only: does the switch have two stable states in real cells? About $2K to $5K, 6 to 10 weeks (planning estimate, not lab quoted). Plus a paid synthetic-biology consultant and lab access. Not a seed round.</w:t>
+              <w:t>Experiment 1 only: do two stable states exist in real cells? Planning figure $2K to $5K, 6 to 10 weeks (never lab quoted), now a floor since the design grew (pilot, 1a, 1b). Plus a paid synthetic-biology consultant and lab access. Not a seed round.</w:t>
+            </w:r>
+          </w:p>
+          <w:p>
+            <w:pPr>
+              <w:spacing w:before="80"/>
+            </w:pPr>
+            <w:r>
+              <w:rPr>
+                <w:b/>
+                <w:color w:val="1F5F3F"/>
+                <w:sz w:val="21"/>
+              </w:rPr>
+              <w:t>NEXT STEPS</w:t>
+            </w:r>
+          </w:p>
+          <w:p>
+            <w:pPr>
+              <w:ind w:left="144" w:hanging="144"/>
+            </w:pPr>
+            <w:r>
+              <w:t xml:space="preserve">• </w:t>
+            </w:r>
+            <w:r>
+              <w:t>Have a B. subtilis microbiologist review the protocol (docs/PROTOCOL_REVIEW_HANDOFF.md). Decide if voltage is the point (docs/VOLTAGE_DECISION_MEMO.md). Noise setting being re-checked (audit Part 31).</w:t>
             </w:r>
           </w:p>
         </w:tc>
@@ -285,10 +309,10 @@
               <w:rPr>
                 <w:b/>
               </w:rPr>
-              <w:t xml:space="preserve">Survives: </w:t>
+              <w:t xml:space="preserve">Survives, with conditions: </w:t>
             </w:r>
             <w:r>
-              <w:t>Colony cut to 2% (lowest tested, not a limit) still recovers. Bar is 70%.</w:t>
+              <w:t>2% (lowest tested) recovers if survivors are all correct and noise is under about 5x the assumed level.</w:t>
             </w:r>
           </w:p>
           <w:p>
@@ -305,7 +329,7 @@
               <w:t xml:space="preserve">Division noise: </w:t>
             </w:r>
             <w:r>
-              <w:t>Fine to about 5 molecules per cell. Weak near 1. A proposed damage-sensing circuit fixes it, not built.</w:t>
+              <w:t>Fine to about 5 molecules per cell, weak near 1. A proposed damage-sensing circuit fixes it, unbuilt.</w:t>
             </w:r>
           </w:p>
           <w:p>
@@ -319,10 +343,10 @@
               <w:rPr>
                 <w:b/>
               </w:rPr>
-              <w:t xml:space="preserve">Reporter: </w:t>
+              <w:t xml:space="preserve">Long runs: </w:t>
             </w:r>
             <w:r>
-              <w:t>Colour tracks the genes exactly.</w:t>
+              <w:t>Cells that drop the circuit can outgrow the rest and mimic memory loss. A risk for 3-day runs.</w:t>
             </w:r>
           </w:p>
           <w:p>
@@ -339,7 +363,7 @@
               <w:t xml:space="preserve">Voltage read: </w:t>
             </w:r>
             <w:r>
-              <w:t>Colony potassium rhythm scrambles a quick read. Averaging about 3 hours fixes it.</w:t>
+              <w:t>Potassium rhythm scrambles a quick read. Averaging about 3 hours fixes it, but it breaks if division slows or voltage drifts about 35 mV. Colour is robust.</w:t>
             </w:r>
           </w:p>
           <w:p>
@@ -386,7 +410,7 @@
               <w:t xml:space="preserve">Assumed: </w:t>
             </w:r>
             <w:r>
-              <w:t>Noise levels, molecules per cell, voltage levels.</w:t>
+              <w:t>Noise levels, molecules per cell, voltage levels, fitness cost.</w:t>
             </w:r>
           </w:p>
           <w:p>
@@ -403,7 +427,7 @@
               <w:t xml:space="preserve">Unknown: </w:t>
             </w:r>
             <w:r>
-              <w:t>Survives real damage and regrowth. Gene drives real voltage.</w:t>
+              <w:t>Survives real damage and regrowth. Gene drives voltage. Edge over a DNA memory.</w:t>
             </w:r>
           </w:p>
           <w:p>
@@ -427,7 +451,7 @@
               <w:t xml:space="preserve">• </w:t>
             </w:r>
             <w:r>
-              <w:t>About 40 simulation files, 17 unit tests pass (cover analysis code only, not the biology). 7 wet-lab experiments, run in order, each a go or no-go gate. Only Experiment 1 has a price.</w:t>
+              <w:t>43 simulation files, 17 unit tests pass (analysis code only). 7 wet-lab experiments, each a go or no-go gate. Only Experiment 1 has a (floor) price.</w:t>
             </w:r>
           </w:p>
           <w:p>
@@ -438,7 +462,7 @@
               <w:t xml:space="preserve">• </w:t>
             </w:r>
             <w:r>
-              <w:t>Simulations: Python, published equations (Gardner 2000, Huh and Paulsson 2011), AI-assisted coding, checked against papers. Parameters: some published, some assumed and labelled.</w:t>
+              <w:t>Simulations: Python, published equations (Gardner 2000, Huh and Paulsson 2011), AI-assisted coding. Some parameters published, some assumed.</w:t>
             </w:r>
           </w:p>
           <w:p>
@@ -473,7 +497,7 @@
               <w:t xml:space="preserve">• </w:t>
             </w:r>
             <w:r>
-              <w:t>"Nobody stored data in bioelectric state." "24 hours, under 1% error." "Proven" for a simulation. Any capacity, market size or cost for Experiments 2 to 7. That a prototype exists. That AI agreement equals verification.</w:t>
+              <w:t>"Nobody stored data in bioelectric state." "24 hours, under 1% error." "Proven" for a simulation. "2% recovers fully" without conditions. That we beat Bonnet's DNA memory. That AI agreement is verification. Any cost for Experiments 2 to 7.</w:t>
             </w:r>
           </w:p>
           <w:p>
@@ -497,7 +521,7 @@
               <w:t xml:space="preserve">• </w:t>
             </w:r>
             <w:r>
-              <w:t>"I do not know that yet. Here is what I do know." Or: "I would rather check than guess. I will send you the answer with the source." Then send it.</w:t>
+              <w:t>"I do not know that yet. Here is what I do know." Or: "I would rather check than guess. I will send the answer with the source."</w:t>
             </w:r>
           </w:p>
           <w:p>

</xml_diff>

<commit_message>
Add molecular colony regrowth and boost rerun (sim 36); sync guide, cheat sheet, README, maps
Co-Authored-By: Claude Sonnet 5.5 <noreply@anthropic.com>
Claude-Session: https://claude.ai/code/session_016Mr3C22Kski8z67f9E5xyj
</commit_message>
<xml_diff>
--- a/docs/ACHERON_CHEAT_SHEET.docx
+++ b/docs/ACHERON_CHEAT_SHEET.docx
@@ -286,17 +286,14 @@
               <w:ind w:left="144" w:hanging="144"/>
             </w:pPr>
             <w:r>
-              <w:t xml:space="preserve">• </w:t>
+              <w:t>• Rule found: Toggle works only if the two promoters are matched (algebra agrees). Mismatch gives one setting.</w:t>
             </w:r>
             <w:r>
               <w:rPr>
                 <w:b/>
               </w:rPr>
-              <w:t xml:space="preserve">Rule found: </w:t>
             </w:r>
-            <w:r>
-              <w:t>Toggle works only if the two promoters are matched (algebra agrees). Mismatch gives one setting.</w:t>
-            </w:r>
+            <w:r/>
           </w:p>
           <w:p>
             <w:pPr>
@@ -320,17 +317,14 @@
               <w:ind w:left="144" w:hanging="144"/>
             </w:pPr>
             <w:r>
-              <w:t xml:space="preserve">• </w:t>
+              <w:t>• Division noise: Colony model: fine to 5 molecules. Molecular: about 12 to 100. Boost circuit unbuilt.</w:t>
             </w:r>
             <w:r>
               <w:rPr>
                 <w:b/>
               </w:rPr>
-              <w:t xml:space="preserve">Division noise: </w:t>
             </w:r>
-            <w:r>
-              <w:t>Fine to about 5 molecules per cell, weak near 1. A proposed damage-sensing circuit fixes it, unbuilt.</w:t>
-            </w:r>
+            <w:r/>
           </w:p>
           <w:p>
             <w:pPr>
@@ -448,11 +442,9 @@
               <w:ind w:left="144" w:hanging="144"/>
             </w:pPr>
             <w:r>
-              <w:t xml:space="preserve">• </w:t>
+              <w:t>• 49 simulation files, 17 unit tests pass (analysis code only). 7 wet-lab experiments, each a go or no-go gate. Only Experiment 1 has a (floor) price.</w:t>
             </w:r>
-            <w:r>
-              <w:t>43 simulation files, 17 unit tests pass (analysis code only). 7 wet-lab experiments, each a go or no-go gate. Only Experiment 1 has a (floor) price.</w:t>
-            </w:r>
+            <w:r/>
           </w:p>
           <w:p>
             <w:pPr>

</xml_diff>